<commit_message>
Update B00153639 Josh Treacy - Computer Vision Assignment 2 - Report.docx
</commit_message>
<xml_diff>
--- a/B00153639 Josh Treacy - Computer Vision Assignment 2 - Report.docx
+++ b/B00153639 Josh Treacy - Computer Vision Assignment 2 - Report.docx
@@ -560,7 +560,6 @@
               <w:tab w:val="right" w:leader="dot" w:pos="9016"/>
             </w:tabs>
             <w:rPr>
-              <w:rFonts w:ascii="Calibri" w:hAnsi="Calibri" w:cs="Calibri"/>
               <w:noProof/>
               <w:kern w:val="2"/>
               <w:sz w:val="24"/>
@@ -587,7 +586,7 @@
             </w:rPr>
             <w:fldChar w:fldCharType="separate"/>
           </w:r>
-          <w:hyperlink w:anchor="_Toc227675042" w:history="1">
+          <w:hyperlink w:anchor="_Toc227675341" w:history="1">
             <w:r>
               <w:rPr>
                 <w:rStyle w:val="Hyperlink"/>
@@ -601,7 +600,6 @@
             </w:r>
             <w:r>
               <w:rPr>
-                <w:rFonts w:ascii="Calibri" w:hAnsi="Calibri" w:cs="Calibri"/>
                 <w:noProof/>
                 <w:webHidden/>
               </w:rPr>
@@ -609,7 +607,6 @@
             </w:r>
             <w:r>
               <w:rPr>
-                <w:rFonts w:ascii="Calibri" w:hAnsi="Calibri" w:cs="Calibri"/>
                 <w:noProof/>
                 <w:webHidden/>
               </w:rPr>
@@ -617,22 +614,19 @@
             </w:r>
             <w:r>
               <w:rPr>
-                <w:rFonts w:ascii="Calibri" w:hAnsi="Calibri" w:cs="Calibri"/>
                 <w:noProof/>
                 <w:webHidden/>
               </w:rPr>
-              <w:instrText xml:space="preserve"> PAGEREF _Toc227675042 \h </w:instrText>
-            </w:r>
-            <w:r>
-              <w:rPr>
-                <w:rFonts w:ascii="Calibri" w:hAnsi="Calibri" w:cs="Calibri"/>
+              <w:instrText xml:space="preserve"> PAGEREF _Toc227675341 \h </w:instrText>
+            </w:r>
+            <w:r>
+              <w:rPr>
                 <w:noProof/>
                 <w:webHidden/>
               </w:rPr>
             </w:r>
             <w:r>
               <w:rPr>
-                <w:rFonts w:ascii="Calibri" w:hAnsi="Calibri" w:cs="Calibri"/>
                 <w:noProof/>
                 <w:webHidden/>
               </w:rPr>
@@ -640,7 +634,6 @@
             </w:r>
             <w:r>
               <w:rPr>
-                <w:rFonts w:ascii="Calibri" w:hAnsi="Calibri" w:cs="Calibri"/>
                 <w:noProof/>
                 <w:webHidden/>
               </w:rPr>
@@ -648,7 +641,6 @@
             </w:r>
             <w:r>
               <w:rPr>
-                <w:rFonts w:ascii="Calibri" w:hAnsi="Calibri" w:cs="Calibri"/>
                 <w:noProof/>
                 <w:webHidden/>
               </w:rPr>
@@ -663,7 +655,6 @@
               <w:tab w:val="right" w:leader="dot" w:pos="9016"/>
             </w:tabs>
             <w:rPr>
-              <w:rFonts w:ascii="Calibri" w:hAnsi="Calibri" w:cs="Calibri"/>
               <w:noProof/>
               <w:kern w:val="2"/>
               <w:sz w:val="24"/>
@@ -672,7 +663,7 @@
               <w14:ligatures w14:val="standardContextual"/>
             </w:rPr>
           </w:pPr>
-          <w:hyperlink w:anchor="_Toc227675043" w:history="1">
+          <w:hyperlink w:anchor="_Toc227675342" w:history="1">
             <w:r>
               <w:rPr>
                 <w:rStyle w:val="Hyperlink"/>
@@ -684,7 +675,6 @@
             </w:r>
             <w:r>
               <w:rPr>
-                <w:rFonts w:ascii="Calibri" w:hAnsi="Calibri" w:cs="Calibri"/>
                 <w:noProof/>
                 <w:webHidden/>
               </w:rPr>
@@ -692,7 +682,6 @@
             </w:r>
             <w:r>
               <w:rPr>
-                <w:rFonts w:ascii="Calibri" w:hAnsi="Calibri" w:cs="Calibri"/>
                 <w:noProof/>
                 <w:webHidden/>
               </w:rPr>
@@ -700,22 +689,19 @@
             </w:r>
             <w:r>
               <w:rPr>
-                <w:rFonts w:ascii="Calibri" w:hAnsi="Calibri" w:cs="Calibri"/>
                 <w:noProof/>
                 <w:webHidden/>
               </w:rPr>
-              <w:instrText xml:space="preserve"> PAGEREF _Toc227675043 \h </w:instrText>
-            </w:r>
-            <w:r>
-              <w:rPr>
-                <w:rFonts w:ascii="Calibri" w:hAnsi="Calibri" w:cs="Calibri"/>
+              <w:instrText xml:space="preserve"> PAGEREF _Toc227675342 \h </w:instrText>
+            </w:r>
+            <w:r>
+              <w:rPr>
                 <w:noProof/>
                 <w:webHidden/>
               </w:rPr>
             </w:r>
             <w:r>
               <w:rPr>
-                <w:rFonts w:ascii="Calibri" w:hAnsi="Calibri" w:cs="Calibri"/>
                 <w:noProof/>
                 <w:webHidden/>
               </w:rPr>
@@ -723,7 +709,6 @@
             </w:r>
             <w:r>
               <w:rPr>
-                <w:rFonts w:ascii="Calibri" w:hAnsi="Calibri" w:cs="Calibri"/>
                 <w:noProof/>
                 <w:webHidden/>
               </w:rPr>
@@ -731,7 +716,6 @@
             </w:r>
             <w:r>
               <w:rPr>
-                <w:rFonts w:ascii="Calibri" w:hAnsi="Calibri" w:cs="Calibri"/>
                 <w:noProof/>
                 <w:webHidden/>
               </w:rPr>
@@ -746,7 +730,6 @@
               <w:tab w:val="right" w:leader="dot" w:pos="9016"/>
             </w:tabs>
             <w:rPr>
-              <w:rFonts w:ascii="Calibri" w:hAnsi="Calibri" w:cs="Calibri"/>
               <w:noProof/>
               <w:kern w:val="2"/>
               <w:sz w:val="24"/>
@@ -755,7 +738,7 @@
               <w14:ligatures w14:val="standardContextual"/>
             </w:rPr>
           </w:pPr>
-          <w:hyperlink w:anchor="_Toc227675044" w:history="1">
+          <w:hyperlink w:anchor="_Toc227675343" w:history="1">
             <w:r>
               <w:rPr>
                 <w:rStyle w:val="Hyperlink"/>
@@ -767,7 +750,6 @@
             </w:r>
             <w:r>
               <w:rPr>
-                <w:rFonts w:ascii="Calibri" w:hAnsi="Calibri" w:cs="Calibri"/>
                 <w:noProof/>
                 <w:webHidden/>
               </w:rPr>
@@ -775,7 +757,6 @@
             </w:r>
             <w:r>
               <w:rPr>
-                <w:rFonts w:ascii="Calibri" w:hAnsi="Calibri" w:cs="Calibri"/>
                 <w:noProof/>
                 <w:webHidden/>
               </w:rPr>
@@ -783,22 +764,19 @@
             </w:r>
             <w:r>
               <w:rPr>
-                <w:rFonts w:ascii="Calibri" w:hAnsi="Calibri" w:cs="Calibri"/>
                 <w:noProof/>
                 <w:webHidden/>
               </w:rPr>
-              <w:instrText xml:space="preserve"> PAGEREF _Toc227675044 \h </w:instrText>
-            </w:r>
-            <w:r>
-              <w:rPr>
-                <w:rFonts w:ascii="Calibri" w:hAnsi="Calibri" w:cs="Calibri"/>
+              <w:instrText xml:space="preserve"> PAGEREF _Toc227675343 \h </w:instrText>
+            </w:r>
+            <w:r>
+              <w:rPr>
                 <w:noProof/>
                 <w:webHidden/>
               </w:rPr>
             </w:r>
             <w:r>
               <w:rPr>
-                <w:rFonts w:ascii="Calibri" w:hAnsi="Calibri" w:cs="Calibri"/>
                 <w:noProof/>
                 <w:webHidden/>
               </w:rPr>
@@ -806,7 +784,6 @@
             </w:r>
             <w:r>
               <w:rPr>
-                <w:rFonts w:ascii="Calibri" w:hAnsi="Calibri" w:cs="Calibri"/>
                 <w:noProof/>
                 <w:webHidden/>
               </w:rPr>
@@ -814,7 +791,6 @@
             </w:r>
             <w:r>
               <w:rPr>
-                <w:rFonts w:ascii="Calibri" w:hAnsi="Calibri" w:cs="Calibri"/>
                 <w:noProof/>
                 <w:webHidden/>
               </w:rPr>
@@ -829,7 +805,6 @@
               <w:tab w:val="right" w:leader="dot" w:pos="9016"/>
             </w:tabs>
             <w:rPr>
-              <w:rFonts w:ascii="Calibri" w:hAnsi="Calibri" w:cs="Calibri"/>
               <w:noProof/>
               <w:kern w:val="2"/>
               <w:sz w:val="24"/>
@@ -838,7 +813,7 @@
               <w14:ligatures w14:val="standardContextual"/>
             </w:rPr>
           </w:pPr>
-          <w:hyperlink w:anchor="_Toc227675045" w:history="1">
+          <w:hyperlink w:anchor="_Toc227675344" w:history="1">
             <w:r>
               <w:rPr>
                 <w:rStyle w:val="Hyperlink"/>
@@ -849,7 +824,6 @@
             </w:r>
             <w:r>
               <w:rPr>
-                <w:rFonts w:ascii="Calibri" w:hAnsi="Calibri" w:cs="Calibri"/>
                 <w:noProof/>
                 <w:webHidden/>
               </w:rPr>
@@ -857,7 +831,6 @@
             </w:r>
             <w:r>
               <w:rPr>
-                <w:rFonts w:ascii="Calibri" w:hAnsi="Calibri" w:cs="Calibri"/>
                 <w:noProof/>
                 <w:webHidden/>
               </w:rPr>
@@ -865,22 +838,19 @@
             </w:r>
             <w:r>
               <w:rPr>
-                <w:rFonts w:ascii="Calibri" w:hAnsi="Calibri" w:cs="Calibri"/>
                 <w:noProof/>
                 <w:webHidden/>
               </w:rPr>
-              <w:instrText xml:space="preserve"> PAGEREF _Toc227675045 \h </w:instrText>
-            </w:r>
-            <w:r>
-              <w:rPr>
-                <w:rFonts w:ascii="Calibri" w:hAnsi="Calibri" w:cs="Calibri"/>
+              <w:instrText xml:space="preserve"> PAGEREF _Toc227675344 \h </w:instrText>
+            </w:r>
+            <w:r>
+              <w:rPr>
                 <w:noProof/>
                 <w:webHidden/>
               </w:rPr>
             </w:r>
             <w:r>
               <w:rPr>
-                <w:rFonts w:ascii="Calibri" w:hAnsi="Calibri" w:cs="Calibri"/>
                 <w:noProof/>
                 <w:webHidden/>
               </w:rPr>
@@ -888,7 +858,6 @@
             </w:r>
             <w:r>
               <w:rPr>
-                <w:rFonts w:ascii="Calibri" w:hAnsi="Calibri" w:cs="Calibri"/>
                 <w:noProof/>
                 <w:webHidden/>
               </w:rPr>
@@ -896,7 +865,6 @@
             </w:r>
             <w:r>
               <w:rPr>
-                <w:rFonts w:ascii="Calibri" w:hAnsi="Calibri" w:cs="Calibri"/>
                 <w:noProof/>
                 <w:webHidden/>
               </w:rPr>
@@ -911,7 +879,6 @@
               <w:tab w:val="right" w:leader="dot" w:pos="9016"/>
             </w:tabs>
             <w:rPr>
-              <w:rFonts w:ascii="Calibri" w:hAnsi="Calibri" w:cs="Calibri"/>
               <w:noProof/>
               <w:kern w:val="2"/>
               <w:sz w:val="24"/>
@@ -920,7 +887,7 @@
               <w14:ligatures w14:val="standardContextual"/>
             </w:rPr>
           </w:pPr>
-          <w:hyperlink w:anchor="_Toc227675046" w:history="1">
+          <w:hyperlink w:anchor="_Toc227675345" w:history="1">
             <w:r>
               <w:rPr>
                 <w:rStyle w:val="Hyperlink"/>
@@ -934,7 +901,6 @@
             </w:r>
             <w:r>
               <w:rPr>
-                <w:rFonts w:ascii="Calibri" w:hAnsi="Calibri" w:cs="Calibri"/>
                 <w:noProof/>
                 <w:webHidden/>
               </w:rPr>
@@ -942,7 +908,6 @@
             </w:r>
             <w:r>
               <w:rPr>
-                <w:rFonts w:ascii="Calibri" w:hAnsi="Calibri" w:cs="Calibri"/>
                 <w:noProof/>
                 <w:webHidden/>
               </w:rPr>
@@ -950,22 +915,19 @@
             </w:r>
             <w:r>
               <w:rPr>
-                <w:rFonts w:ascii="Calibri" w:hAnsi="Calibri" w:cs="Calibri"/>
                 <w:noProof/>
                 <w:webHidden/>
               </w:rPr>
-              <w:instrText xml:space="preserve"> PAGEREF _Toc227675046 \h </w:instrText>
-            </w:r>
-            <w:r>
-              <w:rPr>
-                <w:rFonts w:ascii="Calibri" w:hAnsi="Calibri" w:cs="Calibri"/>
+              <w:instrText xml:space="preserve"> PAGEREF _Toc227675345 \h </w:instrText>
+            </w:r>
+            <w:r>
+              <w:rPr>
                 <w:noProof/>
                 <w:webHidden/>
               </w:rPr>
             </w:r>
             <w:r>
               <w:rPr>
-                <w:rFonts w:ascii="Calibri" w:hAnsi="Calibri" w:cs="Calibri"/>
                 <w:noProof/>
                 <w:webHidden/>
               </w:rPr>
@@ -973,7 +935,6 @@
             </w:r>
             <w:r>
               <w:rPr>
-                <w:rFonts w:ascii="Calibri" w:hAnsi="Calibri" w:cs="Calibri"/>
                 <w:noProof/>
                 <w:webHidden/>
               </w:rPr>
@@ -981,7 +942,6 @@
             </w:r>
             <w:r>
               <w:rPr>
-                <w:rFonts w:ascii="Calibri" w:hAnsi="Calibri" w:cs="Calibri"/>
                 <w:noProof/>
                 <w:webHidden/>
               </w:rPr>
@@ -996,7 +956,6 @@
               <w:tab w:val="right" w:leader="dot" w:pos="9016"/>
             </w:tabs>
             <w:rPr>
-              <w:rFonts w:ascii="Calibri" w:hAnsi="Calibri" w:cs="Calibri"/>
               <w:noProof/>
               <w:kern w:val="2"/>
               <w:sz w:val="24"/>
@@ -1005,7 +964,7 @@
               <w14:ligatures w14:val="standardContextual"/>
             </w:rPr>
           </w:pPr>
-          <w:hyperlink w:anchor="_Toc227675047" w:history="1">
+          <w:hyperlink w:anchor="_Toc227675346" w:history="1">
             <w:r>
               <w:rPr>
                 <w:rStyle w:val="Hyperlink"/>
@@ -1017,7 +976,6 @@
             </w:r>
             <w:r>
               <w:rPr>
-                <w:rFonts w:ascii="Calibri" w:hAnsi="Calibri" w:cs="Calibri"/>
                 <w:noProof/>
                 <w:webHidden/>
               </w:rPr>
@@ -1025,7 +983,6 @@
             </w:r>
             <w:r>
               <w:rPr>
-                <w:rFonts w:ascii="Calibri" w:hAnsi="Calibri" w:cs="Calibri"/>
                 <w:noProof/>
                 <w:webHidden/>
               </w:rPr>
@@ -1033,22 +990,19 @@
             </w:r>
             <w:r>
               <w:rPr>
-                <w:rFonts w:ascii="Calibri" w:hAnsi="Calibri" w:cs="Calibri"/>
                 <w:noProof/>
                 <w:webHidden/>
               </w:rPr>
-              <w:instrText xml:space="preserve"> PAGEREF _Toc227675047 \h </w:instrText>
-            </w:r>
-            <w:r>
-              <w:rPr>
-                <w:rFonts w:ascii="Calibri" w:hAnsi="Calibri" w:cs="Calibri"/>
+              <w:instrText xml:space="preserve"> PAGEREF _Toc227675346 \h </w:instrText>
+            </w:r>
+            <w:r>
+              <w:rPr>
                 <w:noProof/>
                 <w:webHidden/>
               </w:rPr>
             </w:r>
             <w:r>
               <w:rPr>
-                <w:rFonts w:ascii="Calibri" w:hAnsi="Calibri" w:cs="Calibri"/>
                 <w:noProof/>
                 <w:webHidden/>
               </w:rPr>
@@ -1056,7 +1010,6 @@
             </w:r>
             <w:r>
               <w:rPr>
-                <w:rFonts w:ascii="Calibri" w:hAnsi="Calibri" w:cs="Calibri"/>
                 <w:noProof/>
                 <w:webHidden/>
               </w:rPr>
@@ -1064,7 +1017,6 @@
             </w:r>
             <w:r>
               <w:rPr>
-                <w:rFonts w:ascii="Calibri" w:hAnsi="Calibri" w:cs="Calibri"/>
                 <w:noProof/>
                 <w:webHidden/>
               </w:rPr>
@@ -1079,7 +1031,6 @@
               <w:tab w:val="right" w:leader="dot" w:pos="9016"/>
             </w:tabs>
             <w:rPr>
-              <w:rFonts w:ascii="Calibri" w:hAnsi="Calibri" w:cs="Calibri"/>
               <w:noProof/>
               <w:kern w:val="2"/>
               <w:sz w:val="24"/>
@@ -1088,7 +1039,7 @@
               <w14:ligatures w14:val="standardContextual"/>
             </w:rPr>
           </w:pPr>
-          <w:hyperlink w:anchor="_Toc227675048" w:history="1">
+          <w:hyperlink w:anchor="_Toc227675347" w:history="1">
             <w:r>
               <w:rPr>
                 <w:rStyle w:val="Hyperlink"/>
@@ -1100,7 +1051,6 @@
             </w:r>
             <w:r>
               <w:rPr>
-                <w:rFonts w:ascii="Calibri" w:hAnsi="Calibri" w:cs="Calibri"/>
                 <w:noProof/>
                 <w:webHidden/>
               </w:rPr>
@@ -1108,7 +1058,6 @@
             </w:r>
             <w:r>
               <w:rPr>
-                <w:rFonts w:ascii="Calibri" w:hAnsi="Calibri" w:cs="Calibri"/>
                 <w:noProof/>
                 <w:webHidden/>
               </w:rPr>
@@ -1116,22 +1065,19 @@
             </w:r>
             <w:r>
               <w:rPr>
-                <w:rFonts w:ascii="Calibri" w:hAnsi="Calibri" w:cs="Calibri"/>
                 <w:noProof/>
                 <w:webHidden/>
               </w:rPr>
-              <w:instrText xml:space="preserve"> PAGEREF _Toc227675048 \h </w:instrText>
-            </w:r>
-            <w:r>
-              <w:rPr>
-                <w:rFonts w:ascii="Calibri" w:hAnsi="Calibri" w:cs="Calibri"/>
+              <w:instrText xml:space="preserve"> PAGEREF _Toc227675347 \h </w:instrText>
+            </w:r>
+            <w:r>
+              <w:rPr>
                 <w:noProof/>
                 <w:webHidden/>
               </w:rPr>
             </w:r>
             <w:r>
               <w:rPr>
-                <w:rFonts w:ascii="Calibri" w:hAnsi="Calibri" w:cs="Calibri"/>
                 <w:noProof/>
                 <w:webHidden/>
               </w:rPr>
@@ -1139,7 +1085,6 @@
             </w:r>
             <w:r>
               <w:rPr>
-                <w:rFonts w:ascii="Calibri" w:hAnsi="Calibri" w:cs="Calibri"/>
                 <w:noProof/>
                 <w:webHidden/>
               </w:rPr>
@@ -1147,7 +1092,6 @@
             </w:r>
             <w:r>
               <w:rPr>
-                <w:rFonts w:ascii="Calibri" w:hAnsi="Calibri" w:cs="Calibri"/>
                 <w:noProof/>
                 <w:webHidden/>
               </w:rPr>
@@ -1162,7 +1106,6 @@
               <w:tab w:val="right" w:leader="dot" w:pos="9016"/>
             </w:tabs>
             <w:rPr>
-              <w:rFonts w:ascii="Calibri" w:hAnsi="Calibri" w:cs="Calibri"/>
               <w:noProof/>
               <w:kern w:val="2"/>
               <w:sz w:val="24"/>
@@ -1171,7 +1114,7 @@
               <w14:ligatures w14:val="standardContextual"/>
             </w:rPr>
           </w:pPr>
-          <w:hyperlink w:anchor="_Toc227675049" w:history="1">
+          <w:hyperlink w:anchor="_Toc227675348" w:history="1">
             <w:r>
               <w:rPr>
                 <w:rStyle w:val="Hyperlink"/>
@@ -1183,7 +1126,6 @@
             </w:r>
             <w:r>
               <w:rPr>
-                <w:rFonts w:ascii="Calibri" w:hAnsi="Calibri" w:cs="Calibri"/>
                 <w:noProof/>
                 <w:webHidden/>
               </w:rPr>
@@ -1191,7 +1133,6 @@
             </w:r>
             <w:r>
               <w:rPr>
-                <w:rFonts w:ascii="Calibri" w:hAnsi="Calibri" w:cs="Calibri"/>
                 <w:noProof/>
                 <w:webHidden/>
               </w:rPr>
@@ -1199,22 +1140,19 @@
             </w:r>
             <w:r>
               <w:rPr>
-                <w:rFonts w:ascii="Calibri" w:hAnsi="Calibri" w:cs="Calibri"/>
                 <w:noProof/>
                 <w:webHidden/>
               </w:rPr>
-              <w:instrText xml:space="preserve"> PAGEREF _Toc227675049 \h </w:instrText>
-            </w:r>
-            <w:r>
-              <w:rPr>
-                <w:rFonts w:ascii="Calibri" w:hAnsi="Calibri" w:cs="Calibri"/>
+              <w:instrText xml:space="preserve"> PAGEREF _Toc227675348 \h </w:instrText>
+            </w:r>
+            <w:r>
+              <w:rPr>
                 <w:noProof/>
                 <w:webHidden/>
               </w:rPr>
             </w:r>
             <w:r>
               <w:rPr>
-                <w:rFonts w:ascii="Calibri" w:hAnsi="Calibri" w:cs="Calibri"/>
                 <w:noProof/>
                 <w:webHidden/>
               </w:rPr>
@@ -1222,7 +1160,6 @@
             </w:r>
             <w:r>
               <w:rPr>
-                <w:rFonts w:ascii="Calibri" w:hAnsi="Calibri" w:cs="Calibri"/>
                 <w:noProof/>
                 <w:webHidden/>
               </w:rPr>
@@ -1230,7 +1167,6 @@
             </w:r>
             <w:r>
               <w:rPr>
-                <w:rFonts w:ascii="Calibri" w:hAnsi="Calibri" w:cs="Calibri"/>
                 <w:noProof/>
                 <w:webHidden/>
               </w:rPr>
@@ -1245,7 +1181,6 @@
               <w:tab w:val="right" w:leader="dot" w:pos="9016"/>
             </w:tabs>
             <w:rPr>
-              <w:rFonts w:ascii="Calibri" w:hAnsi="Calibri" w:cs="Calibri"/>
               <w:noProof/>
               <w:kern w:val="2"/>
               <w:sz w:val="24"/>
@@ -1254,7 +1189,7 @@
               <w14:ligatures w14:val="standardContextual"/>
             </w:rPr>
           </w:pPr>
-          <w:hyperlink w:anchor="_Toc227675050" w:history="1">
+          <w:hyperlink w:anchor="_Toc227675349" w:history="1">
             <w:r>
               <w:rPr>
                 <w:rStyle w:val="Hyperlink"/>
@@ -1266,7 +1201,6 @@
             </w:r>
             <w:r>
               <w:rPr>
-                <w:rFonts w:ascii="Calibri" w:hAnsi="Calibri" w:cs="Calibri"/>
                 <w:noProof/>
                 <w:webHidden/>
               </w:rPr>
@@ -1274,7 +1208,6 @@
             </w:r>
             <w:r>
               <w:rPr>
-                <w:rFonts w:ascii="Calibri" w:hAnsi="Calibri" w:cs="Calibri"/>
                 <w:noProof/>
                 <w:webHidden/>
               </w:rPr>
@@ -1282,22 +1215,19 @@
             </w:r>
             <w:r>
               <w:rPr>
-                <w:rFonts w:ascii="Calibri" w:hAnsi="Calibri" w:cs="Calibri"/>
                 <w:noProof/>
                 <w:webHidden/>
               </w:rPr>
-              <w:instrText xml:space="preserve"> PAGEREF _Toc227675050 \h </w:instrText>
-            </w:r>
-            <w:r>
-              <w:rPr>
-                <w:rFonts w:ascii="Calibri" w:hAnsi="Calibri" w:cs="Calibri"/>
+              <w:instrText xml:space="preserve"> PAGEREF _Toc227675349 \h </w:instrText>
+            </w:r>
+            <w:r>
+              <w:rPr>
                 <w:noProof/>
                 <w:webHidden/>
               </w:rPr>
             </w:r>
             <w:r>
               <w:rPr>
-                <w:rFonts w:ascii="Calibri" w:hAnsi="Calibri" w:cs="Calibri"/>
                 <w:noProof/>
                 <w:webHidden/>
               </w:rPr>
@@ -1305,7 +1235,6 @@
             </w:r>
             <w:r>
               <w:rPr>
-                <w:rFonts w:ascii="Calibri" w:hAnsi="Calibri" w:cs="Calibri"/>
                 <w:noProof/>
                 <w:webHidden/>
               </w:rPr>
@@ -1313,7 +1242,6 @@
             </w:r>
             <w:r>
               <w:rPr>
-                <w:rFonts w:ascii="Calibri" w:hAnsi="Calibri" w:cs="Calibri"/>
                 <w:noProof/>
                 <w:webHidden/>
               </w:rPr>
@@ -1328,7 +1256,6 @@
               <w:tab w:val="right" w:leader="dot" w:pos="9016"/>
             </w:tabs>
             <w:rPr>
-              <w:rFonts w:ascii="Calibri" w:hAnsi="Calibri" w:cs="Calibri"/>
               <w:noProof/>
               <w:kern w:val="2"/>
               <w:sz w:val="24"/>
@@ -1337,7 +1264,7 @@
               <w14:ligatures w14:val="standardContextual"/>
             </w:rPr>
           </w:pPr>
-          <w:hyperlink w:anchor="_Toc227675051" w:history="1">
+          <w:hyperlink w:anchor="_Toc227675350" w:history="1">
             <w:r>
               <w:rPr>
                 <w:rStyle w:val="Hyperlink"/>
@@ -1350,7 +1277,6 @@
             </w:r>
             <w:r>
               <w:rPr>
-                <w:rFonts w:ascii="Calibri" w:hAnsi="Calibri" w:cs="Calibri"/>
                 <w:noProof/>
                 <w:webHidden/>
               </w:rPr>
@@ -1358,7 +1284,6 @@
             </w:r>
             <w:r>
               <w:rPr>
-                <w:rFonts w:ascii="Calibri" w:hAnsi="Calibri" w:cs="Calibri"/>
                 <w:noProof/>
                 <w:webHidden/>
               </w:rPr>
@@ -1366,22 +1291,19 @@
             </w:r>
             <w:r>
               <w:rPr>
-                <w:rFonts w:ascii="Calibri" w:hAnsi="Calibri" w:cs="Calibri"/>
                 <w:noProof/>
                 <w:webHidden/>
               </w:rPr>
-              <w:instrText xml:space="preserve"> PAGEREF _Toc227675051 \h </w:instrText>
-            </w:r>
-            <w:r>
-              <w:rPr>
-                <w:rFonts w:ascii="Calibri" w:hAnsi="Calibri" w:cs="Calibri"/>
+              <w:instrText xml:space="preserve"> PAGEREF _Toc227675350 \h </w:instrText>
+            </w:r>
+            <w:r>
+              <w:rPr>
                 <w:noProof/>
                 <w:webHidden/>
               </w:rPr>
             </w:r>
             <w:r>
               <w:rPr>
-                <w:rFonts w:ascii="Calibri" w:hAnsi="Calibri" w:cs="Calibri"/>
                 <w:noProof/>
                 <w:webHidden/>
               </w:rPr>
@@ -1389,7 +1311,6 @@
             </w:r>
             <w:r>
               <w:rPr>
-                <w:rFonts w:ascii="Calibri" w:hAnsi="Calibri" w:cs="Calibri"/>
                 <w:noProof/>
                 <w:webHidden/>
               </w:rPr>
@@ -1397,7 +1318,6 @@
             </w:r>
             <w:r>
               <w:rPr>
-                <w:rFonts w:ascii="Calibri" w:hAnsi="Calibri" w:cs="Calibri"/>
                 <w:noProof/>
                 <w:webHidden/>
               </w:rPr>
@@ -1412,7 +1332,6 @@
               <w:tab w:val="right" w:leader="dot" w:pos="9016"/>
             </w:tabs>
             <w:rPr>
-              <w:rFonts w:ascii="Calibri" w:hAnsi="Calibri" w:cs="Calibri"/>
               <w:noProof/>
               <w:kern w:val="2"/>
               <w:sz w:val="24"/>
@@ -1421,7 +1340,7 @@
               <w14:ligatures w14:val="standardContextual"/>
             </w:rPr>
           </w:pPr>
-          <w:hyperlink w:anchor="_Toc227675052" w:history="1">
+          <w:hyperlink w:anchor="_Toc227675351" w:history="1">
             <w:r>
               <w:rPr>
                 <w:rStyle w:val="Hyperlink"/>
@@ -1432,7 +1351,6 @@
             </w:r>
             <w:r>
               <w:rPr>
-                <w:rFonts w:ascii="Calibri" w:hAnsi="Calibri" w:cs="Calibri"/>
                 <w:noProof/>
                 <w:webHidden/>
               </w:rPr>
@@ -1440,7 +1358,6 @@
             </w:r>
             <w:r>
               <w:rPr>
-                <w:rFonts w:ascii="Calibri" w:hAnsi="Calibri" w:cs="Calibri"/>
                 <w:noProof/>
                 <w:webHidden/>
               </w:rPr>
@@ -1448,22 +1365,19 @@
             </w:r>
             <w:r>
               <w:rPr>
-                <w:rFonts w:ascii="Calibri" w:hAnsi="Calibri" w:cs="Calibri"/>
                 <w:noProof/>
                 <w:webHidden/>
               </w:rPr>
-              <w:instrText xml:space="preserve"> PAGEREF _Toc227675052 \h </w:instrText>
-            </w:r>
-            <w:r>
-              <w:rPr>
-                <w:rFonts w:ascii="Calibri" w:hAnsi="Calibri" w:cs="Calibri"/>
+              <w:instrText xml:space="preserve"> PAGEREF _Toc227675351 \h </w:instrText>
+            </w:r>
+            <w:r>
+              <w:rPr>
                 <w:noProof/>
                 <w:webHidden/>
               </w:rPr>
             </w:r>
             <w:r>
               <w:rPr>
-                <w:rFonts w:ascii="Calibri" w:hAnsi="Calibri" w:cs="Calibri"/>
                 <w:noProof/>
                 <w:webHidden/>
               </w:rPr>
@@ -1471,7 +1385,6 @@
             </w:r>
             <w:r>
               <w:rPr>
-                <w:rFonts w:ascii="Calibri" w:hAnsi="Calibri" w:cs="Calibri"/>
                 <w:noProof/>
                 <w:webHidden/>
               </w:rPr>
@@ -1479,7 +1392,6 @@
             </w:r>
             <w:r>
               <w:rPr>
-                <w:rFonts w:ascii="Calibri" w:hAnsi="Calibri" w:cs="Calibri"/>
                 <w:noProof/>
                 <w:webHidden/>
               </w:rPr>
@@ -1494,7 +1406,6 @@
               <w:tab w:val="right" w:leader="dot" w:pos="9016"/>
             </w:tabs>
             <w:rPr>
-              <w:rFonts w:ascii="Calibri" w:hAnsi="Calibri" w:cs="Calibri"/>
               <w:noProof/>
               <w:kern w:val="2"/>
               <w:sz w:val="24"/>
@@ -1503,7 +1414,7 @@
               <w14:ligatures w14:val="standardContextual"/>
             </w:rPr>
           </w:pPr>
-          <w:hyperlink w:anchor="_Toc227675053" w:history="1">
+          <w:hyperlink w:anchor="_Toc227675352" w:history="1">
             <w:r>
               <w:rPr>
                 <w:rStyle w:val="Hyperlink"/>
@@ -1514,7 +1425,6 @@
             </w:r>
             <w:r>
               <w:rPr>
-                <w:rFonts w:ascii="Calibri" w:hAnsi="Calibri" w:cs="Calibri"/>
                 <w:noProof/>
                 <w:webHidden/>
               </w:rPr>
@@ -1522,7 +1432,6 @@
             </w:r>
             <w:r>
               <w:rPr>
-                <w:rFonts w:ascii="Calibri" w:hAnsi="Calibri" w:cs="Calibri"/>
                 <w:noProof/>
                 <w:webHidden/>
               </w:rPr>
@@ -1530,22 +1439,19 @@
             </w:r>
             <w:r>
               <w:rPr>
-                <w:rFonts w:ascii="Calibri" w:hAnsi="Calibri" w:cs="Calibri"/>
                 <w:noProof/>
                 <w:webHidden/>
               </w:rPr>
-              <w:instrText xml:space="preserve"> PAGEREF _Toc227675053 \h </w:instrText>
-            </w:r>
-            <w:r>
-              <w:rPr>
-                <w:rFonts w:ascii="Calibri" w:hAnsi="Calibri" w:cs="Calibri"/>
+              <w:instrText xml:space="preserve"> PAGEREF _Toc227675352 \h </w:instrText>
+            </w:r>
+            <w:r>
+              <w:rPr>
                 <w:noProof/>
                 <w:webHidden/>
               </w:rPr>
             </w:r>
             <w:r>
               <w:rPr>
-                <w:rFonts w:ascii="Calibri" w:hAnsi="Calibri" w:cs="Calibri"/>
                 <w:noProof/>
                 <w:webHidden/>
               </w:rPr>
@@ -1553,7 +1459,6 @@
             </w:r>
             <w:r>
               <w:rPr>
-                <w:rFonts w:ascii="Calibri" w:hAnsi="Calibri" w:cs="Calibri"/>
                 <w:noProof/>
                 <w:webHidden/>
               </w:rPr>
@@ -1561,7 +1466,6 @@
             </w:r>
             <w:r>
               <w:rPr>
-                <w:rFonts w:ascii="Calibri" w:hAnsi="Calibri" w:cs="Calibri"/>
                 <w:noProof/>
                 <w:webHidden/>
               </w:rPr>
@@ -1576,7 +1480,6 @@
               <w:tab w:val="right" w:leader="dot" w:pos="9016"/>
             </w:tabs>
             <w:rPr>
-              <w:rFonts w:ascii="Calibri" w:hAnsi="Calibri" w:cs="Calibri"/>
               <w:noProof/>
               <w:kern w:val="2"/>
               <w:sz w:val="24"/>
@@ -1585,7 +1488,7 @@
               <w14:ligatures w14:val="standardContextual"/>
             </w:rPr>
           </w:pPr>
-          <w:hyperlink w:anchor="_Toc227675054" w:history="1">
+          <w:hyperlink w:anchor="_Toc227675353" w:history="1">
             <w:r>
               <w:rPr>
                 <w:rStyle w:val="Hyperlink"/>
@@ -1596,7 +1499,6 @@
             </w:r>
             <w:r>
               <w:rPr>
-                <w:rFonts w:ascii="Calibri" w:hAnsi="Calibri" w:cs="Calibri"/>
                 <w:noProof/>
                 <w:webHidden/>
               </w:rPr>
@@ -1604,7 +1506,6 @@
             </w:r>
             <w:r>
               <w:rPr>
-                <w:rFonts w:ascii="Calibri" w:hAnsi="Calibri" w:cs="Calibri"/>
                 <w:noProof/>
                 <w:webHidden/>
               </w:rPr>
@@ -1612,22 +1513,19 @@
             </w:r>
             <w:r>
               <w:rPr>
-                <w:rFonts w:ascii="Calibri" w:hAnsi="Calibri" w:cs="Calibri"/>
                 <w:noProof/>
                 <w:webHidden/>
               </w:rPr>
-              <w:instrText xml:space="preserve"> PAGEREF _Toc227675054 \h </w:instrText>
-            </w:r>
-            <w:r>
-              <w:rPr>
-                <w:rFonts w:ascii="Calibri" w:hAnsi="Calibri" w:cs="Calibri"/>
+              <w:instrText xml:space="preserve"> PAGEREF _Toc227675353 \h </w:instrText>
+            </w:r>
+            <w:r>
+              <w:rPr>
                 <w:noProof/>
                 <w:webHidden/>
               </w:rPr>
             </w:r>
             <w:r>
               <w:rPr>
-                <w:rFonts w:ascii="Calibri" w:hAnsi="Calibri" w:cs="Calibri"/>
                 <w:noProof/>
                 <w:webHidden/>
               </w:rPr>
@@ -1635,7 +1533,6 @@
             </w:r>
             <w:r>
               <w:rPr>
-                <w:rFonts w:ascii="Calibri" w:hAnsi="Calibri" w:cs="Calibri"/>
                 <w:noProof/>
                 <w:webHidden/>
               </w:rPr>
@@ -1643,7 +1540,6 @@
             </w:r>
             <w:r>
               <w:rPr>
-                <w:rFonts w:ascii="Calibri" w:hAnsi="Calibri" w:cs="Calibri"/>
                 <w:noProof/>
                 <w:webHidden/>
               </w:rPr>
@@ -1658,7 +1554,6 @@
               <w:tab w:val="right" w:leader="dot" w:pos="9016"/>
             </w:tabs>
             <w:rPr>
-              <w:rFonts w:ascii="Calibri" w:hAnsi="Calibri" w:cs="Calibri"/>
               <w:noProof/>
               <w:kern w:val="2"/>
               <w:sz w:val="24"/>
@@ -1667,7 +1562,7 @@
               <w14:ligatures w14:val="standardContextual"/>
             </w:rPr>
           </w:pPr>
-          <w:hyperlink w:anchor="_Toc227675055" w:history="1">
+          <w:hyperlink w:anchor="_Toc227675354" w:history="1">
             <w:r>
               <w:rPr>
                 <w:rStyle w:val="Hyperlink"/>
@@ -1680,7 +1575,6 @@
             </w:r>
             <w:r>
               <w:rPr>
-                <w:rFonts w:ascii="Calibri" w:hAnsi="Calibri" w:cs="Calibri"/>
                 <w:noProof/>
                 <w:webHidden/>
               </w:rPr>
@@ -1688,7 +1582,6 @@
             </w:r>
             <w:r>
               <w:rPr>
-                <w:rFonts w:ascii="Calibri" w:hAnsi="Calibri" w:cs="Calibri"/>
                 <w:noProof/>
                 <w:webHidden/>
               </w:rPr>
@@ -1696,22 +1589,19 @@
             </w:r>
             <w:r>
               <w:rPr>
-                <w:rFonts w:ascii="Calibri" w:hAnsi="Calibri" w:cs="Calibri"/>
                 <w:noProof/>
                 <w:webHidden/>
               </w:rPr>
-              <w:instrText xml:space="preserve"> PAGEREF _Toc227675055 \h </w:instrText>
-            </w:r>
-            <w:r>
-              <w:rPr>
-                <w:rFonts w:ascii="Calibri" w:hAnsi="Calibri" w:cs="Calibri"/>
+              <w:instrText xml:space="preserve"> PAGEREF _Toc227675354 \h </w:instrText>
+            </w:r>
+            <w:r>
+              <w:rPr>
                 <w:noProof/>
                 <w:webHidden/>
               </w:rPr>
             </w:r>
             <w:r>
               <w:rPr>
-                <w:rFonts w:ascii="Calibri" w:hAnsi="Calibri" w:cs="Calibri"/>
                 <w:noProof/>
                 <w:webHidden/>
               </w:rPr>
@@ -1719,7 +1609,6 @@
             </w:r>
             <w:r>
               <w:rPr>
-                <w:rFonts w:ascii="Calibri" w:hAnsi="Calibri" w:cs="Calibri"/>
                 <w:noProof/>
                 <w:webHidden/>
               </w:rPr>
@@ -1727,7 +1616,6 @@
             </w:r>
             <w:r>
               <w:rPr>
-                <w:rFonts w:ascii="Calibri" w:hAnsi="Calibri" w:cs="Calibri"/>
                 <w:noProof/>
                 <w:webHidden/>
               </w:rPr>
@@ -1742,7 +1630,6 @@
               <w:tab w:val="right" w:leader="dot" w:pos="9016"/>
             </w:tabs>
             <w:rPr>
-              <w:rFonts w:ascii="Calibri" w:hAnsi="Calibri" w:cs="Calibri"/>
               <w:noProof/>
               <w:kern w:val="2"/>
               <w:sz w:val="24"/>
@@ -1751,7 +1638,7 @@
               <w14:ligatures w14:val="standardContextual"/>
             </w:rPr>
           </w:pPr>
-          <w:hyperlink w:anchor="_Toc227675056" w:history="1">
+          <w:hyperlink w:anchor="_Toc227675355" w:history="1">
             <w:r>
               <w:rPr>
                 <w:rStyle w:val="Hyperlink"/>
@@ -1762,7 +1649,6 @@
             </w:r>
             <w:r>
               <w:rPr>
-                <w:rFonts w:ascii="Calibri" w:hAnsi="Calibri" w:cs="Calibri"/>
                 <w:noProof/>
                 <w:webHidden/>
               </w:rPr>
@@ -1770,7 +1656,6 @@
             </w:r>
             <w:r>
               <w:rPr>
-                <w:rFonts w:ascii="Calibri" w:hAnsi="Calibri" w:cs="Calibri"/>
                 <w:noProof/>
                 <w:webHidden/>
               </w:rPr>
@@ -1778,22 +1663,19 @@
             </w:r>
             <w:r>
               <w:rPr>
-                <w:rFonts w:ascii="Calibri" w:hAnsi="Calibri" w:cs="Calibri"/>
                 <w:noProof/>
                 <w:webHidden/>
               </w:rPr>
-              <w:instrText xml:space="preserve"> PAGEREF _Toc227675056 \h </w:instrText>
-            </w:r>
-            <w:r>
-              <w:rPr>
-                <w:rFonts w:ascii="Calibri" w:hAnsi="Calibri" w:cs="Calibri"/>
+              <w:instrText xml:space="preserve"> PAGEREF _Toc227675355 \h </w:instrText>
+            </w:r>
+            <w:r>
+              <w:rPr>
                 <w:noProof/>
                 <w:webHidden/>
               </w:rPr>
             </w:r>
             <w:r>
               <w:rPr>
-                <w:rFonts w:ascii="Calibri" w:hAnsi="Calibri" w:cs="Calibri"/>
                 <w:noProof/>
                 <w:webHidden/>
               </w:rPr>
@@ -1801,7 +1683,6 @@
             </w:r>
             <w:r>
               <w:rPr>
-                <w:rFonts w:ascii="Calibri" w:hAnsi="Calibri" w:cs="Calibri"/>
                 <w:noProof/>
                 <w:webHidden/>
               </w:rPr>
@@ -1809,7 +1690,6 @@
             </w:r>
             <w:r>
               <w:rPr>
-                <w:rFonts w:ascii="Calibri" w:hAnsi="Calibri" w:cs="Calibri"/>
                 <w:noProof/>
                 <w:webHidden/>
               </w:rPr>
@@ -1824,7 +1704,6 @@
               <w:tab w:val="right" w:leader="dot" w:pos="9016"/>
             </w:tabs>
             <w:rPr>
-              <w:rFonts w:ascii="Calibri" w:hAnsi="Calibri" w:cs="Calibri"/>
               <w:noProof/>
               <w:kern w:val="2"/>
               <w:sz w:val="24"/>
@@ -1833,7 +1712,7 @@
               <w14:ligatures w14:val="standardContextual"/>
             </w:rPr>
           </w:pPr>
-          <w:hyperlink w:anchor="_Toc227675057" w:history="1">
+          <w:hyperlink w:anchor="_Toc227675356" w:history="1">
             <w:r>
               <w:rPr>
                 <w:rStyle w:val="Hyperlink"/>
@@ -1844,7 +1723,6 @@
             </w:r>
             <w:r>
               <w:rPr>
-                <w:rFonts w:ascii="Calibri" w:hAnsi="Calibri" w:cs="Calibri"/>
                 <w:noProof/>
                 <w:webHidden/>
               </w:rPr>
@@ -1852,7 +1730,6 @@
             </w:r>
             <w:r>
               <w:rPr>
-                <w:rFonts w:ascii="Calibri" w:hAnsi="Calibri" w:cs="Calibri"/>
                 <w:noProof/>
                 <w:webHidden/>
               </w:rPr>
@@ -1860,22 +1737,19 @@
             </w:r>
             <w:r>
               <w:rPr>
-                <w:rFonts w:ascii="Calibri" w:hAnsi="Calibri" w:cs="Calibri"/>
                 <w:noProof/>
                 <w:webHidden/>
               </w:rPr>
-              <w:instrText xml:space="preserve"> PAGEREF _Toc227675057 \h </w:instrText>
-            </w:r>
-            <w:r>
-              <w:rPr>
-                <w:rFonts w:ascii="Calibri" w:hAnsi="Calibri" w:cs="Calibri"/>
+              <w:instrText xml:space="preserve"> PAGEREF _Toc227675356 \h </w:instrText>
+            </w:r>
+            <w:r>
+              <w:rPr>
                 <w:noProof/>
                 <w:webHidden/>
               </w:rPr>
             </w:r>
             <w:r>
               <w:rPr>
-                <w:rFonts w:ascii="Calibri" w:hAnsi="Calibri" w:cs="Calibri"/>
                 <w:noProof/>
                 <w:webHidden/>
               </w:rPr>
@@ -1883,7 +1757,6 @@
             </w:r>
             <w:r>
               <w:rPr>
-                <w:rFonts w:ascii="Calibri" w:hAnsi="Calibri" w:cs="Calibri"/>
                 <w:noProof/>
                 <w:webHidden/>
               </w:rPr>
@@ -1891,7 +1764,6 @@
             </w:r>
             <w:r>
               <w:rPr>
-                <w:rFonts w:ascii="Calibri" w:hAnsi="Calibri" w:cs="Calibri"/>
                 <w:noProof/>
                 <w:webHidden/>
               </w:rPr>
@@ -1906,7 +1778,6 @@
               <w:tab w:val="right" w:leader="dot" w:pos="9016"/>
             </w:tabs>
             <w:rPr>
-              <w:rFonts w:ascii="Calibri" w:hAnsi="Calibri" w:cs="Calibri"/>
               <w:noProof/>
               <w:kern w:val="2"/>
               <w:sz w:val="24"/>
@@ -1915,7 +1786,7 @@
               <w14:ligatures w14:val="standardContextual"/>
             </w:rPr>
           </w:pPr>
-          <w:hyperlink w:anchor="_Toc227675058" w:history="1">
+          <w:hyperlink w:anchor="_Toc227675357" w:history="1">
             <w:r>
               <w:rPr>
                 <w:rStyle w:val="Hyperlink"/>
@@ -1926,7 +1797,6 @@
             </w:r>
             <w:r>
               <w:rPr>
-                <w:rFonts w:ascii="Calibri" w:hAnsi="Calibri" w:cs="Calibri"/>
                 <w:noProof/>
                 <w:webHidden/>
               </w:rPr>
@@ -1934,7 +1804,6 @@
             </w:r>
             <w:r>
               <w:rPr>
-                <w:rFonts w:ascii="Calibri" w:hAnsi="Calibri" w:cs="Calibri"/>
                 <w:noProof/>
                 <w:webHidden/>
               </w:rPr>
@@ -1942,22 +1811,19 @@
             </w:r>
             <w:r>
               <w:rPr>
-                <w:rFonts w:ascii="Calibri" w:hAnsi="Calibri" w:cs="Calibri"/>
                 <w:noProof/>
                 <w:webHidden/>
               </w:rPr>
-              <w:instrText xml:space="preserve"> PAGEREF _Toc227675058 \h </w:instrText>
-            </w:r>
-            <w:r>
-              <w:rPr>
-                <w:rFonts w:ascii="Calibri" w:hAnsi="Calibri" w:cs="Calibri"/>
+              <w:instrText xml:space="preserve"> PAGEREF _Toc227675357 \h </w:instrText>
+            </w:r>
+            <w:r>
+              <w:rPr>
                 <w:noProof/>
                 <w:webHidden/>
               </w:rPr>
             </w:r>
             <w:r>
               <w:rPr>
-                <w:rFonts w:ascii="Calibri" w:hAnsi="Calibri" w:cs="Calibri"/>
                 <w:noProof/>
                 <w:webHidden/>
               </w:rPr>
@@ -1965,7 +1831,6 @@
             </w:r>
             <w:r>
               <w:rPr>
-                <w:rFonts w:ascii="Calibri" w:hAnsi="Calibri" w:cs="Calibri"/>
                 <w:noProof/>
                 <w:webHidden/>
               </w:rPr>
@@ -1973,7 +1838,6 @@
             </w:r>
             <w:r>
               <w:rPr>
-                <w:rFonts w:ascii="Calibri" w:hAnsi="Calibri" w:cs="Calibri"/>
                 <w:noProof/>
                 <w:webHidden/>
               </w:rPr>
@@ -1988,7 +1852,6 @@
               <w:tab w:val="right" w:leader="dot" w:pos="9016"/>
             </w:tabs>
             <w:rPr>
-              <w:rFonts w:ascii="Calibri" w:hAnsi="Calibri" w:cs="Calibri"/>
               <w:noProof/>
               <w:kern w:val="2"/>
               <w:sz w:val="24"/>
@@ -1997,7 +1860,7 @@
               <w14:ligatures w14:val="standardContextual"/>
             </w:rPr>
           </w:pPr>
-          <w:hyperlink w:anchor="_Toc227675059" w:history="1">
+          <w:hyperlink w:anchor="_Toc227675358" w:history="1">
             <w:r>
               <w:rPr>
                 <w:rStyle w:val="Hyperlink"/>
@@ -2008,7 +1871,6 @@
             </w:r>
             <w:r>
               <w:rPr>
-                <w:rFonts w:ascii="Calibri" w:hAnsi="Calibri" w:cs="Calibri"/>
                 <w:noProof/>
                 <w:webHidden/>
               </w:rPr>
@@ -2016,7 +1878,6 @@
             </w:r>
             <w:r>
               <w:rPr>
-                <w:rFonts w:ascii="Calibri" w:hAnsi="Calibri" w:cs="Calibri"/>
                 <w:noProof/>
                 <w:webHidden/>
               </w:rPr>
@@ -2024,22 +1885,19 @@
             </w:r>
             <w:r>
               <w:rPr>
-                <w:rFonts w:ascii="Calibri" w:hAnsi="Calibri" w:cs="Calibri"/>
                 <w:noProof/>
                 <w:webHidden/>
               </w:rPr>
-              <w:instrText xml:space="preserve"> PAGEREF _Toc227675059 \h </w:instrText>
-            </w:r>
-            <w:r>
-              <w:rPr>
-                <w:rFonts w:ascii="Calibri" w:hAnsi="Calibri" w:cs="Calibri"/>
+              <w:instrText xml:space="preserve"> PAGEREF _Toc227675358 \h </w:instrText>
+            </w:r>
+            <w:r>
+              <w:rPr>
                 <w:noProof/>
                 <w:webHidden/>
               </w:rPr>
             </w:r>
             <w:r>
               <w:rPr>
-                <w:rFonts w:ascii="Calibri" w:hAnsi="Calibri" w:cs="Calibri"/>
                 <w:noProof/>
                 <w:webHidden/>
               </w:rPr>
@@ -2047,7 +1905,6 @@
             </w:r>
             <w:r>
               <w:rPr>
-                <w:rFonts w:ascii="Calibri" w:hAnsi="Calibri" w:cs="Calibri"/>
                 <w:noProof/>
                 <w:webHidden/>
               </w:rPr>
@@ -2055,7 +1912,6 @@
             </w:r>
             <w:r>
               <w:rPr>
-                <w:rFonts w:ascii="Calibri" w:hAnsi="Calibri" w:cs="Calibri"/>
                 <w:noProof/>
                 <w:webHidden/>
               </w:rPr>
@@ -2070,7 +1926,6 @@
               <w:tab w:val="right" w:leader="dot" w:pos="9016"/>
             </w:tabs>
             <w:rPr>
-              <w:rFonts w:ascii="Calibri" w:hAnsi="Calibri" w:cs="Calibri"/>
               <w:noProof/>
               <w:kern w:val="2"/>
               <w:sz w:val="24"/>
@@ -2079,7 +1934,7 @@
               <w14:ligatures w14:val="standardContextual"/>
             </w:rPr>
           </w:pPr>
-          <w:hyperlink w:anchor="_Toc227675060" w:history="1">
+          <w:hyperlink w:anchor="_Toc227675359" w:history="1">
             <w:r>
               <w:rPr>
                 <w:rStyle w:val="Hyperlink"/>
@@ -2090,7 +1945,6 @@
             </w:r>
             <w:r>
               <w:rPr>
-                <w:rFonts w:ascii="Calibri" w:hAnsi="Calibri" w:cs="Calibri"/>
                 <w:noProof/>
                 <w:webHidden/>
               </w:rPr>
@@ -2098,7 +1952,6 @@
             </w:r>
             <w:r>
               <w:rPr>
-                <w:rFonts w:ascii="Calibri" w:hAnsi="Calibri" w:cs="Calibri"/>
                 <w:noProof/>
                 <w:webHidden/>
               </w:rPr>
@@ -2106,22 +1959,19 @@
             </w:r>
             <w:r>
               <w:rPr>
-                <w:rFonts w:ascii="Calibri" w:hAnsi="Calibri" w:cs="Calibri"/>
                 <w:noProof/>
                 <w:webHidden/>
               </w:rPr>
-              <w:instrText xml:space="preserve"> PAGEREF _Toc227675060 \h </w:instrText>
-            </w:r>
-            <w:r>
-              <w:rPr>
-                <w:rFonts w:ascii="Calibri" w:hAnsi="Calibri" w:cs="Calibri"/>
+              <w:instrText xml:space="preserve"> PAGEREF _Toc227675359 \h </w:instrText>
+            </w:r>
+            <w:r>
+              <w:rPr>
                 <w:noProof/>
                 <w:webHidden/>
               </w:rPr>
             </w:r>
             <w:r>
               <w:rPr>
-                <w:rFonts w:ascii="Calibri" w:hAnsi="Calibri" w:cs="Calibri"/>
                 <w:noProof/>
                 <w:webHidden/>
               </w:rPr>
@@ -2129,7 +1979,6 @@
             </w:r>
             <w:r>
               <w:rPr>
-                <w:rFonts w:ascii="Calibri" w:hAnsi="Calibri" w:cs="Calibri"/>
                 <w:noProof/>
                 <w:webHidden/>
               </w:rPr>
@@ -2137,7 +1986,6 @@
             </w:r>
             <w:r>
               <w:rPr>
-                <w:rFonts w:ascii="Calibri" w:hAnsi="Calibri" w:cs="Calibri"/>
                 <w:noProof/>
                 <w:webHidden/>
               </w:rPr>
@@ -2152,7 +2000,6 @@
               <w:tab w:val="right" w:leader="dot" w:pos="9016"/>
             </w:tabs>
             <w:rPr>
-              <w:rFonts w:ascii="Calibri" w:hAnsi="Calibri" w:cs="Calibri"/>
               <w:noProof/>
               <w:kern w:val="2"/>
               <w:sz w:val="24"/>
@@ -2161,7 +2008,7 @@
               <w14:ligatures w14:val="standardContextual"/>
             </w:rPr>
           </w:pPr>
-          <w:hyperlink w:anchor="_Toc227675061" w:history="1">
+          <w:hyperlink w:anchor="_Toc227675360" w:history="1">
             <w:r>
               <w:rPr>
                 <w:rStyle w:val="Hyperlink"/>
@@ -2172,7 +2019,6 @@
             </w:r>
             <w:r>
               <w:rPr>
-                <w:rFonts w:ascii="Calibri" w:hAnsi="Calibri" w:cs="Calibri"/>
                 <w:noProof/>
                 <w:webHidden/>
               </w:rPr>
@@ -2180,7 +2026,6 @@
             </w:r>
             <w:r>
               <w:rPr>
-                <w:rFonts w:ascii="Calibri" w:hAnsi="Calibri" w:cs="Calibri"/>
                 <w:noProof/>
                 <w:webHidden/>
               </w:rPr>
@@ -2188,22 +2033,19 @@
             </w:r>
             <w:r>
               <w:rPr>
-                <w:rFonts w:ascii="Calibri" w:hAnsi="Calibri" w:cs="Calibri"/>
                 <w:noProof/>
                 <w:webHidden/>
               </w:rPr>
-              <w:instrText xml:space="preserve"> PAGEREF _Toc227675061 \h </w:instrText>
-            </w:r>
-            <w:r>
-              <w:rPr>
-                <w:rFonts w:ascii="Calibri" w:hAnsi="Calibri" w:cs="Calibri"/>
+              <w:instrText xml:space="preserve"> PAGEREF _Toc227675360 \h </w:instrText>
+            </w:r>
+            <w:r>
+              <w:rPr>
                 <w:noProof/>
                 <w:webHidden/>
               </w:rPr>
             </w:r>
             <w:r>
               <w:rPr>
-                <w:rFonts w:ascii="Calibri" w:hAnsi="Calibri" w:cs="Calibri"/>
                 <w:noProof/>
                 <w:webHidden/>
               </w:rPr>
@@ -2211,7 +2053,6 @@
             </w:r>
             <w:r>
               <w:rPr>
-                <w:rFonts w:ascii="Calibri" w:hAnsi="Calibri" w:cs="Calibri"/>
                 <w:noProof/>
                 <w:webHidden/>
               </w:rPr>
@@ -2219,7 +2060,6 @@
             </w:r>
             <w:r>
               <w:rPr>
-                <w:rFonts w:ascii="Calibri" w:hAnsi="Calibri" w:cs="Calibri"/>
                 <w:noProof/>
                 <w:webHidden/>
               </w:rPr>
@@ -2234,7 +2074,6 @@
               <w:tab w:val="right" w:leader="dot" w:pos="9016"/>
             </w:tabs>
             <w:rPr>
-              <w:rFonts w:ascii="Calibri" w:hAnsi="Calibri" w:cs="Calibri"/>
               <w:noProof/>
               <w:kern w:val="2"/>
               <w:sz w:val="24"/>
@@ -2243,7 +2082,7 @@
               <w14:ligatures w14:val="standardContextual"/>
             </w:rPr>
           </w:pPr>
-          <w:hyperlink w:anchor="_Toc227675062" w:history="1">
+          <w:hyperlink w:anchor="_Toc227675361" w:history="1">
             <w:r>
               <w:rPr>
                 <w:rStyle w:val="Hyperlink"/>
@@ -2254,7 +2093,6 @@
             </w:r>
             <w:r>
               <w:rPr>
-                <w:rFonts w:ascii="Calibri" w:hAnsi="Calibri" w:cs="Calibri"/>
                 <w:noProof/>
                 <w:webHidden/>
               </w:rPr>
@@ -2262,7 +2100,6 @@
             </w:r>
             <w:r>
               <w:rPr>
-                <w:rFonts w:ascii="Calibri" w:hAnsi="Calibri" w:cs="Calibri"/>
                 <w:noProof/>
                 <w:webHidden/>
               </w:rPr>
@@ -2270,22 +2107,19 @@
             </w:r>
             <w:r>
               <w:rPr>
-                <w:rFonts w:ascii="Calibri" w:hAnsi="Calibri" w:cs="Calibri"/>
                 <w:noProof/>
                 <w:webHidden/>
               </w:rPr>
-              <w:instrText xml:space="preserve"> PAGEREF _Toc227675062 \h </w:instrText>
-            </w:r>
-            <w:r>
-              <w:rPr>
-                <w:rFonts w:ascii="Calibri" w:hAnsi="Calibri" w:cs="Calibri"/>
+              <w:instrText xml:space="preserve"> PAGEREF _Toc227675361 \h </w:instrText>
+            </w:r>
+            <w:r>
+              <w:rPr>
                 <w:noProof/>
                 <w:webHidden/>
               </w:rPr>
             </w:r>
             <w:r>
               <w:rPr>
-                <w:rFonts w:ascii="Calibri" w:hAnsi="Calibri" w:cs="Calibri"/>
                 <w:noProof/>
                 <w:webHidden/>
               </w:rPr>
@@ -2293,7 +2127,6 @@
             </w:r>
             <w:r>
               <w:rPr>
-                <w:rFonts w:ascii="Calibri" w:hAnsi="Calibri" w:cs="Calibri"/>
                 <w:noProof/>
                 <w:webHidden/>
               </w:rPr>
@@ -2301,7 +2134,6 @@
             </w:r>
             <w:r>
               <w:rPr>
-                <w:rFonts w:ascii="Calibri" w:hAnsi="Calibri" w:cs="Calibri"/>
                 <w:noProof/>
                 <w:webHidden/>
               </w:rPr>
@@ -2316,7 +2148,6 @@
               <w:tab w:val="right" w:leader="dot" w:pos="9016"/>
             </w:tabs>
             <w:rPr>
-              <w:rFonts w:ascii="Calibri" w:hAnsi="Calibri" w:cs="Calibri"/>
               <w:noProof/>
               <w:kern w:val="2"/>
               <w:sz w:val="24"/>
@@ -2325,7 +2156,7 @@
               <w14:ligatures w14:val="standardContextual"/>
             </w:rPr>
           </w:pPr>
-          <w:hyperlink w:anchor="_Toc227675063" w:history="1">
+          <w:hyperlink w:anchor="_Toc227675362" w:history="1">
             <w:r>
               <w:rPr>
                 <w:rStyle w:val="Hyperlink"/>
@@ -2336,7 +2167,6 @@
             </w:r>
             <w:r>
               <w:rPr>
-                <w:rFonts w:ascii="Calibri" w:hAnsi="Calibri" w:cs="Calibri"/>
                 <w:noProof/>
                 <w:webHidden/>
               </w:rPr>
@@ -2344,7 +2174,6 @@
             </w:r>
             <w:r>
               <w:rPr>
-                <w:rFonts w:ascii="Calibri" w:hAnsi="Calibri" w:cs="Calibri"/>
                 <w:noProof/>
                 <w:webHidden/>
               </w:rPr>
@@ -2352,22 +2181,19 @@
             </w:r>
             <w:r>
               <w:rPr>
-                <w:rFonts w:ascii="Calibri" w:hAnsi="Calibri" w:cs="Calibri"/>
                 <w:noProof/>
                 <w:webHidden/>
               </w:rPr>
-              <w:instrText xml:space="preserve"> PAGEREF _Toc227675063 \h </w:instrText>
-            </w:r>
-            <w:r>
-              <w:rPr>
-                <w:rFonts w:ascii="Calibri" w:hAnsi="Calibri" w:cs="Calibri"/>
+              <w:instrText xml:space="preserve"> PAGEREF _Toc227675362 \h </w:instrText>
+            </w:r>
+            <w:r>
+              <w:rPr>
                 <w:noProof/>
                 <w:webHidden/>
               </w:rPr>
             </w:r>
             <w:r>
               <w:rPr>
-                <w:rFonts w:ascii="Calibri" w:hAnsi="Calibri" w:cs="Calibri"/>
                 <w:noProof/>
                 <w:webHidden/>
               </w:rPr>
@@ -2375,7 +2201,6 @@
             </w:r>
             <w:r>
               <w:rPr>
-                <w:rFonts w:ascii="Calibri" w:hAnsi="Calibri" w:cs="Calibri"/>
                 <w:noProof/>
                 <w:webHidden/>
               </w:rPr>
@@ -2383,7 +2208,6 @@
             </w:r>
             <w:r>
               <w:rPr>
-                <w:rFonts w:ascii="Calibri" w:hAnsi="Calibri" w:cs="Calibri"/>
                 <w:noProof/>
                 <w:webHidden/>
               </w:rPr>
@@ -2398,7 +2222,6 @@
               <w:tab w:val="right" w:leader="dot" w:pos="9016"/>
             </w:tabs>
             <w:rPr>
-              <w:rFonts w:ascii="Calibri" w:hAnsi="Calibri" w:cs="Calibri"/>
               <w:noProof/>
               <w:kern w:val="2"/>
               <w:sz w:val="24"/>
@@ -2407,7 +2230,7 @@
               <w14:ligatures w14:val="standardContextual"/>
             </w:rPr>
           </w:pPr>
-          <w:hyperlink w:anchor="_Toc227675064" w:history="1">
+          <w:hyperlink w:anchor="_Toc227675363" w:history="1">
             <w:r>
               <w:rPr>
                 <w:rStyle w:val="Hyperlink"/>
@@ -2418,7 +2241,6 @@
             </w:r>
             <w:r>
               <w:rPr>
-                <w:rFonts w:ascii="Calibri" w:hAnsi="Calibri" w:cs="Calibri"/>
                 <w:noProof/>
                 <w:webHidden/>
               </w:rPr>
@@ -2426,7 +2248,6 @@
             </w:r>
             <w:r>
               <w:rPr>
-                <w:rFonts w:ascii="Calibri" w:hAnsi="Calibri" w:cs="Calibri"/>
                 <w:noProof/>
                 <w:webHidden/>
               </w:rPr>
@@ -2434,22 +2255,19 @@
             </w:r>
             <w:r>
               <w:rPr>
-                <w:rFonts w:ascii="Calibri" w:hAnsi="Calibri" w:cs="Calibri"/>
                 <w:noProof/>
                 <w:webHidden/>
               </w:rPr>
-              <w:instrText xml:space="preserve"> PAGEREF _Toc227675064 \h </w:instrText>
-            </w:r>
-            <w:r>
-              <w:rPr>
-                <w:rFonts w:ascii="Calibri" w:hAnsi="Calibri" w:cs="Calibri"/>
+              <w:instrText xml:space="preserve"> PAGEREF _Toc227675363 \h </w:instrText>
+            </w:r>
+            <w:r>
+              <w:rPr>
                 <w:noProof/>
                 <w:webHidden/>
               </w:rPr>
             </w:r>
             <w:r>
               <w:rPr>
-                <w:rFonts w:ascii="Calibri" w:hAnsi="Calibri" w:cs="Calibri"/>
                 <w:noProof/>
                 <w:webHidden/>
               </w:rPr>
@@ -2457,7 +2275,6 @@
             </w:r>
             <w:r>
               <w:rPr>
-                <w:rFonts w:ascii="Calibri" w:hAnsi="Calibri" w:cs="Calibri"/>
                 <w:noProof/>
                 <w:webHidden/>
               </w:rPr>
@@ -2465,7 +2282,6 @@
             </w:r>
             <w:r>
               <w:rPr>
-                <w:rFonts w:ascii="Calibri" w:hAnsi="Calibri" w:cs="Calibri"/>
                 <w:noProof/>
                 <w:webHidden/>
               </w:rPr>
@@ -2522,7 +2338,7 @@
           <w:lang w:val="en-US"/>
         </w:rPr>
       </w:pPr>
-      <w:bookmarkStart w:id="0" w:name="_Toc227675042"/>
+      <w:bookmarkStart w:id="0" w:name="_Toc227675341"/>
       <w:r>
         <w:rPr>
           <w:rFonts w:ascii="Calibri" w:eastAsia="Times New Roman" w:hAnsi="Calibri" w:cs="Calibri"/>
@@ -2547,7 +2363,23 @@
           <w:rFonts w:ascii="Calibri" w:hAnsi="Calibri" w:cs="Calibri"/>
           <w:lang w:val="en-US"/>
         </w:rPr>
-        <w:t>This project explores the implementation of deep neural networks for image classification tasks using TensorFlow and Keras. The main goal is to accurately classify chest X-ray images into one of three categories: Bacterial Pneumonia, Viral Pneumonia, or Normal. To enhance the effectiveness of the classification, the project employs various model optimization strategies, including regularization and transfer learning, aiming to improve performance and reliability.</w:t>
+        <w:t xml:space="preserve">This project explores the implementation of deep neural networks for image classification tasks using TensorFlow and </w:t>
+      </w:r>
+      <w:proofErr w:type="spellStart"/>
+      <w:r>
+        <w:rPr>
+          <w:rFonts w:ascii="Calibri" w:hAnsi="Calibri" w:cs="Calibri"/>
+          <w:lang w:val="en-US"/>
+        </w:rPr>
+        <w:t>Keras</w:t>
+      </w:r>
+      <w:proofErr w:type="spellEnd"/>
+      <w:r>
+        <w:rPr>
+          <w:rFonts w:ascii="Calibri" w:hAnsi="Calibri" w:cs="Calibri"/>
+          <w:lang w:val="en-US"/>
+        </w:rPr>
+        <w:t>. The main goal is to accurately classify chest X-ray images into one of three categories: Bacterial Pneumonia, Viral Pneumonia, or Normal. To enhance the effectiveness of the classification, the project employs various model optimization strategies, including regularization and transfer learning, aiming to improve performance and reliability.</w:t>
       </w:r>
     </w:p>
     <w:p>
@@ -2558,7 +2390,7 @@
           <w:lang w:val="en-US"/>
         </w:rPr>
       </w:pPr>
-      <w:bookmarkStart w:id="1" w:name="_Toc227675043"/>
+      <w:bookmarkStart w:id="1" w:name="_Toc227675342"/>
       <w:r>
         <w:rPr>
           <w:rFonts w:ascii="Calibri" w:eastAsia="Times New Roman" w:hAnsi="Calibri" w:cs="Calibri"/>
@@ -2591,7 +2423,7 @@
           <w:lang w:val="en-US"/>
         </w:rPr>
       </w:pPr>
-      <w:bookmarkStart w:id="2" w:name="_Toc227675044"/>
+      <w:bookmarkStart w:id="2" w:name="_Toc227675343"/>
       <w:r>
         <w:rPr>
           <w:rFonts w:ascii="Calibri" w:eastAsia="Times New Roman" w:hAnsi="Calibri" w:cs="Calibri"/>
@@ -2623,7 +2455,7 @@
           <w:rFonts w:ascii="Calibri" w:hAnsi="Calibri" w:cs="Calibri"/>
         </w:rPr>
       </w:pPr>
-      <w:bookmarkStart w:id="3" w:name="_Toc227675045"/>
+      <w:bookmarkStart w:id="3" w:name="_Toc227675344"/>
       <w:r>
         <w:rPr>
           <w:rFonts w:ascii="Calibri" w:hAnsi="Calibri" w:cs="Calibri"/>
@@ -2656,7 +2488,7 @@
           <w:lang w:val="en-US"/>
         </w:rPr>
       </w:pPr>
-      <w:bookmarkStart w:id="4" w:name="_Toc227675046"/>
+      <w:bookmarkStart w:id="4" w:name="_Toc227675345"/>
       <w:r>
         <w:rPr>
           <w:rFonts w:ascii="Calibri" w:eastAsia="Times New Roman" w:hAnsi="Calibri" w:cs="Calibri"/>
@@ -2685,7 +2517,7 @@
           <w:lang w:val="en-US"/>
         </w:rPr>
       </w:pPr>
-      <w:bookmarkStart w:id="5" w:name="_Toc227675047"/>
+      <w:bookmarkStart w:id="5" w:name="_Toc227675346"/>
       <w:r>
         <w:rPr>
           <w:rFonts w:ascii="Calibri" w:eastAsia="Times New Roman" w:hAnsi="Calibri" w:cs="Calibri"/>
@@ -2739,7 +2571,7 @@
           <w:lang w:val="en-US"/>
         </w:rPr>
       </w:pPr>
-      <w:bookmarkStart w:id="6" w:name="_Toc227675048"/>
+      <w:bookmarkStart w:id="6" w:name="_Toc227675347"/>
       <w:r>
         <w:rPr>
           <w:rFonts w:ascii="Calibri" w:eastAsia="Times New Roman" w:hAnsi="Calibri" w:cs="Calibri"/>
@@ -3481,7 +3313,7 @@
         </w:rPr>
         <w:br w:type="page"/>
       </w:r>
-      <w:bookmarkStart w:id="7" w:name="_Toc227675049"/>
+      <w:bookmarkStart w:id="7" w:name="_Toc227675348"/>
       <w:r>
         <w:rPr>
           <w:rFonts w:ascii="Calibri" w:eastAsia="Times New Roman" w:hAnsi="Calibri" w:cs="Calibri"/>
@@ -5226,7 +5058,7 @@
           <w:lang w:val="en-US"/>
         </w:rPr>
       </w:pPr>
-      <w:bookmarkStart w:id="8" w:name="_Toc227675050"/>
+      <w:bookmarkStart w:id="8" w:name="_Toc227675349"/>
       <w:r>
         <w:rPr>
           <w:rFonts w:ascii="Calibri" w:eastAsia="Times New Roman" w:hAnsi="Calibri" w:cs="Calibri"/>
@@ -5282,7 +5114,7 @@
           <w:bCs/>
         </w:rPr>
       </w:pPr>
-      <w:bookmarkStart w:id="9" w:name="_Toc227675051"/>
+      <w:bookmarkStart w:id="9" w:name="_Toc227675350"/>
       <w:r>
         <w:rPr>
           <w:rFonts w:ascii="Calibri" w:hAnsi="Calibri" w:cs="Calibri"/>
@@ -5337,7 +5169,7 @@
           <w:rFonts w:ascii="Calibri" w:hAnsi="Calibri" w:cs="Calibri"/>
         </w:rPr>
       </w:pPr>
-      <w:bookmarkStart w:id="10" w:name="_Toc227675052"/>
+      <w:bookmarkStart w:id="10" w:name="_Toc227675351"/>
       <w:r>
         <w:rPr>
           <w:rFonts w:ascii="Calibri" w:hAnsi="Calibri" w:cs="Calibri"/>
@@ -5381,7 +5213,7 @@
           <w:rFonts w:ascii="Calibri" w:hAnsi="Calibri" w:cs="Calibri"/>
         </w:rPr>
       </w:pPr>
-      <w:bookmarkStart w:id="11" w:name="_Toc227675053"/>
+      <w:bookmarkStart w:id="11" w:name="_Toc227675352"/>
       <w:r>
         <w:rPr>
           <w:rFonts w:ascii="Calibri" w:hAnsi="Calibri" w:cs="Calibri"/>
@@ -5504,7 +5336,7 @@
           <w:rFonts w:ascii="Calibri" w:hAnsi="Calibri" w:cs="Calibri"/>
         </w:rPr>
       </w:pPr>
-      <w:bookmarkStart w:id="12" w:name="_Toc227675054"/>
+      <w:bookmarkStart w:id="12" w:name="_Toc227675353"/>
       <w:r>
         <w:rPr>
           <w:rFonts w:ascii="Calibri" w:hAnsi="Calibri" w:cs="Calibri"/>
@@ -5614,7 +5446,7 @@
           <w:rFonts w:ascii="Calibri" w:eastAsia="Times New Roman" w:hAnsi="Calibri" w:cs="Calibri"/>
         </w:rPr>
       </w:pPr>
-      <w:bookmarkStart w:id="13" w:name="_Toc227675055"/>
+      <w:bookmarkStart w:id="13" w:name="_Toc227675354"/>
       <w:r>
         <w:rPr>
           <w:rFonts w:ascii="Calibri" w:eastAsia="Times New Roman" w:hAnsi="Calibri" w:cs="Calibri"/>
@@ -5639,7 +5471,7 @@
           <w:rFonts w:ascii="Calibri" w:eastAsia="Times New Roman" w:hAnsi="Calibri" w:cs="Calibri"/>
         </w:rPr>
       </w:pPr>
-      <w:bookmarkStart w:id="14" w:name="_Toc227675056"/>
+      <w:bookmarkStart w:id="14" w:name="_Toc227675355"/>
       <w:r>
         <w:rPr>
           <w:rFonts w:ascii="Calibri" w:eastAsia="Times New Roman" w:hAnsi="Calibri" w:cs="Calibri"/>
@@ -5722,7 +5554,7 @@
           <w:rFonts w:ascii="Calibri" w:eastAsia="Times New Roman" w:hAnsi="Calibri" w:cs="Calibri"/>
         </w:rPr>
       </w:pPr>
-      <w:bookmarkStart w:id="15" w:name="_Toc227675057"/>
+      <w:bookmarkStart w:id="15" w:name="_Toc227675356"/>
       <w:r>
         <w:rPr>
           <w:rFonts w:ascii="Calibri" w:eastAsia="Times New Roman" w:hAnsi="Calibri" w:cs="Calibri"/>
@@ -5817,8 +5649,18 @@
                 <w:b/>
                 <w:bCs/>
               </w:rPr>
-              <w:t>Train Acc</w:t>
-            </w:r>
+              <w:t xml:space="preserve">Train </w:t>
+            </w:r>
+            <w:proofErr w:type="spellStart"/>
+            <w:r>
+              <w:rPr>
+                <w:rFonts w:ascii="Calibri" w:hAnsi="Calibri" w:cs="Calibri"/>
+                <w:b/>
+                <w:bCs/>
+              </w:rPr>
+              <w:t>Acc</w:t>
+            </w:r>
+            <w:proofErr w:type="spellEnd"/>
             <w:r>
               <w:rPr>
                 <w:rFonts w:ascii="Calibri" w:hAnsi="Calibri" w:cs="Calibri"/>
@@ -5851,8 +5693,18 @@
                 <w:b/>
                 <w:bCs/>
               </w:rPr>
-              <w:t>Val Acc</w:t>
-            </w:r>
+              <w:t xml:space="preserve">Val </w:t>
+            </w:r>
+            <w:proofErr w:type="spellStart"/>
+            <w:r>
+              <w:rPr>
+                <w:rFonts w:ascii="Calibri" w:hAnsi="Calibri" w:cs="Calibri"/>
+                <w:b/>
+                <w:bCs/>
+              </w:rPr>
+              <w:t>Acc</w:t>
+            </w:r>
+            <w:proofErr w:type="spellEnd"/>
             <w:r>
               <w:rPr>
                 <w:rFonts w:ascii="Calibri" w:hAnsi="Calibri" w:cs="Calibri"/>
@@ -5885,8 +5737,18 @@
                 <w:b/>
                 <w:bCs/>
               </w:rPr>
-              <w:t>Test Acc</w:t>
-            </w:r>
+              <w:t xml:space="preserve">Test </w:t>
+            </w:r>
+            <w:proofErr w:type="spellStart"/>
+            <w:r>
+              <w:rPr>
+                <w:rFonts w:ascii="Calibri" w:hAnsi="Calibri" w:cs="Calibri"/>
+                <w:b/>
+                <w:bCs/>
+              </w:rPr>
+              <w:t>Acc</w:t>
+            </w:r>
+            <w:proofErr w:type="spellEnd"/>
             <w:r>
               <w:rPr>
                 <w:rFonts w:ascii="Calibri" w:hAnsi="Calibri" w:cs="Calibri"/>
@@ -6325,14 +6187,6 @@
           <w:szCs w:val="24"/>
         </w:rPr>
       </w:pPr>
-      <w:r>
-        <w:rPr>
-          <w:rFonts w:ascii="Calibri" w:eastAsia="Times New Roman" w:hAnsi="Calibri" w:cs="Calibri"/>
-          <w:sz w:val="24"/>
-          <w:szCs w:val="24"/>
-        </w:rPr>
-        <w:br/>
-      </w:r>
     </w:p>
     <w:p>
       <w:pPr>
@@ -6341,7 +6195,7 @@
           <w:rFonts w:ascii="Calibri" w:eastAsia="Times New Roman" w:hAnsi="Calibri" w:cs="Calibri"/>
         </w:rPr>
       </w:pPr>
-      <w:bookmarkStart w:id="16" w:name="_Toc227675058"/>
+      <w:bookmarkStart w:id="16" w:name="_Toc227675357"/>
       <w:r>
         <w:rPr>
           <w:rFonts w:ascii="Calibri" w:eastAsia="Times New Roman" w:hAnsi="Calibri" w:cs="Calibri"/>
@@ -6370,7 +6224,7 @@
           <w:rFonts w:ascii="Calibri" w:eastAsia="Times New Roman" w:hAnsi="Calibri" w:cs="Calibri"/>
         </w:rPr>
       </w:pPr>
-      <w:bookmarkStart w:id="17" w:name="_Toc227675059"/>
+      <w:bookmarkStart w:id="17" w:name="_Toc227675358"/>
       <w:r>
         <w:rPr>
           <w:rFonts w:ascii="Calibri" w:eastAsia="Times New Roman" w:hAnsi="Calibri" w:cs="Calibri"/>
@@ -6399,7 +6253,7 @@
           <w:rFonts w:ascii="Calibri" w:eastAsia="Times New Roman" w:hAnsi="Calibri" w:cs="Calibri"/>
         </w:rPr>
       </w:pPr>
-      <w:bookmarkStart w:id="18" w:name="_Toc227675060"/>
+      <w:bookmarkStart w:id="18" w:name="_Toc227675359"/>
       <w:r>
         <w:rPr>
           <w:rFonts w:ascii="Calibri" w:eastAsia="Times New Roman" w:hAnsi="Calibri" w:cs="Calibri"/>
@@ -6428,7 +6282,7 @@
           <w:rFonts w:ascii="Calibri" w:eastAsia="Times New Roman" w:hAnsi="Calibri" w:cs="Calibri"/>
         </w:rPr>
       </w:pPr>
-      <w:bookmarkStart w:id="19" w:name="_Toc227675061"/>
+      <w:bookmarkStart w:id="19" w:name="_Toc227675360"/>
       <w:r>
         <w:rPr>
           <w:rFonts w:ascii="Calibri" w:eastAsia="Times New Roman" w:hAnsi="Calibri" w:cs="Calibri"/>
@@ -6458,7 +6312,7 @@
           <w:rFonts w:ascii="Calibri" w:eastAsia="Times New Roman" w:hAnsi="Calibri" w:cs="Calibri"/>
         </w:rPr>
       </w:pPr>
-      <w:bookmarkStart w:id="20" w:name="_Toc227675062"/>
+      <w:bookmarkStart w:id="20" w:name="_Toc227675361"/>
       <w:r>
         <w:rPr>
           <w:rFonts w:ascii="Calibri" w:eastAsia="Times New Roman" w:hAnsi="Calibri" w:cs="Calibri"/>
@@ -6493,7 +6347,7 @@
           <w:rFonts w:ascii="Calibri" w:eastAsia="Times New Roman" w:hAnsi="Calibri" w:cs="Calibri"/>
         </w:rPr>
       </w:pPr>
-      <w:bookmarkStart w:id="21" w:name="_Toc227675063"/>
+      <w:bookmarkStart w:id="21" w:name="_Toc227675362"/>
       <w:r>
         <w:rPr>
           <w:rFonts w:ascii="Calibri" w:eastAsia="Times New Roman" w:hAnsi="Calibri" w:cs="Calibri"/>
@@ -7298,8 +7152,17 @@
                 <w:rFonts w:ascii="Calibri" w:hAnsi="Calibri" w:cs="Calibri"/>
                 <w:color w:val="000000"/>
               </w:rPr>
-              <w:t>macro avg</w:t>
-            </w:r>
+              <w:t xml:space="preserve">macro </w:t>
+            </w:r>
+            <w:proofErr w:type="spellStart"/>
+            <w:r>
+              <w:rPr>
+                <w:rFonts w:ascii="Calibri" w:hAnsi="Calibri" w:cs="Calibri"/>
+                <w:color w:val="000000"/>
+              </w:rPr>
+              <w:t>avg</w:t>
+            </w:r>
+            <w:proofErr w:type="spellEnd"/>
             <w:r>
               <w:rPr>
                 <w:rFonts w:ascii="Calibri" w:hAnsi="Calibri" w:cs="Calibri"/>
@@ -7468,8 +7331,16 @@
               <w:rPr>
                 <w:rFonts w:ascii="Calibri" w:hAnsi="Calibri" w:cs="Calibri"/>
               </w:rPr>
-              <w:t>weighted avg</w:t>
-            </w:r>
+              <w:t xml:space="preserve">weighted </w:t>
+            </w:r>
+            <w:proofErr w:type="spellStart"/>
+            <w:r>
+              <w:rPr>
+                <w:rFonts w:ascii="Calibri" w:hAnsi="Calibri" w:cs="Calibri"/>
+              </w:rPr>
+              <w:t>avg</w:t>
+            </w:r>
+            <w:proofErr w:type="spellEnd"/>
           </w:p>
         </w:tc>
         <w:tc>
@@ -7580,26 +7451,19 @@
     </w:tbl>
     <w:p>
       <w:pPr>
-        <w:spacing w:after="0"/>
         <w:rPr>
           <w:rFonts w:ascii="Calibri" w:eastAsia="Times New Roman" w:hAnsi="Calibri" w:cs="Calibri"/>
-          <w:sz w:val="24"/>
-          <w:szCs w:val="24"/>
         </w:rPr>
       </w:pPr>
       <w:r>
         <w:rPr>
           <w:rFonts w:ascii="Calibri" w:eastAsia="Times New Roman" w:hAnsi="Calibri" w:cs="Calibri"/>
-          <w:sz w:val="24"/>
-          <w:szCs w:val="24"/>
         </w:rPr>
         <w:br/>
       </w:r>
       <w:r>
         <w:rPr>
           <w:rFonts w:ascii="Calibri" w:eastAsia="Times New Roman" w:hAnsi="Calibri" w:cs="Calibri"/>
-          <w:sz w:val="24"/>
-          <w:szCs w:val="24"/>
         </w:rPr>
         <w:t>These quantitative results align with the visual prediction examples, where viral pneumonia cases were more frequently misclassified than other classes.</w:t>
       </w:r>
@@ -7611,7 +7475,7 @@
           <w:rFonts w:ascii="Calibri" w:eastAsia="Times New Roman" w:hAnsi="Calibri" w:cs="Calibri"/>
         </w:rPr>
       </w:pPr>
-      <w:bookmarkStart w:id="22" w:name="_Toc227675064"/>
+      <w:bookmarkStart w:id="22" w:name="_Toc227675363"/>
       <w:r>
         <w:rPr>
           <w:rFonts w:ascii="Calibri" w:eastAsia="Times New Roman" w:hAnsi="Calibri" w:cs="Calibri"/>

</xml_diff>